<commit_message>
Rename trimmed supplement to its final file name
</commit_message>
<xml_diff>
--- a/docs/ACBI_Technical_Solution_Proposal_v1.1_bo_sung.docx
+++ b/docs/ACBI_Technical_Solution_Proposal_v1.1_bo_sung.docx
@@ -22,7 +22,7 @@
           <w:i w:val="0"/>
           <w:color w:val="555B66"/>
         </w:rPr>
-        <w:t>Bổ sung các nội dung đã có trong hệ thống nhưng chưa có trong tài liệu v1.0 (arc42). Mỗi mục ghi rõ chèn vào mục nào của tài liệu.</w:t>
+        <w:t>Chỉ gồm thiết kế lâu dài mà hệ thống đã có nhưng bản v1.0 chưa mô tả. Mỗi mục ghi rõ chèn vào mục nào của tài liệu. Kết quả đo và số liệu kiểm thử không nằm ở đây mà ở báo cáo kiểm thử (docs/ACBI_bao_cao_kiem_thu.xlsx).</w:t>
       </w:r>
     </w:p>
     <w:p>
@@ -35,7 +35,7 @@
           <w:i/>
           <w:color w:val="555B66"/>
         </w:rPr>
-        <w:t>Ngày lập: 2026-10-13. Các con số kiểm thử lấy từ báo cáo docs/ACBI_bao_cao_kiem_thu.xlsx; chỗ chưa có số được ghi rõ là chưa có.</w:t>
+        <w:t>Ngày lập: 2026-10-14.</w:t>
       </w:r>
     </w:p>
     <w:p>
@@ -73,7 +73,7 @@
         <w:spacing w:after="40"/>
       </w:pPr>
       <w:r>
-        <w:t>Phương pháp: ETS (làm trơn hàm mũ) theo Hyndman (2008), sáu cấu hình (không xu hướng, xu hướng cộng, xu hướng cộng tắt dần, mỗi loại có hoặc không mùa vụ 12 tháng), chọn theo tiêu chí AICc. Cài đặt đã được đối chiếu với thư viện statsmodels trong kiểm thử tự động.</w:t>
+        <w:t>Phương pháp: ETS (làm trơn hàm mũ) theo Hyndman (2008), sáu cấu hình (không xu hướng, xu hướng cộng, xu hướng cộng tắt dần, mỗi loại có hoặc không mùa vụ 12 tháng), chọn theo tiêu chí AICc; khoảng tin cậy 95% theo công thức giải tích của ETS. Cài đặt được đối chiếu với thư viện statsmodels trong kiểm thử tự động.</w:t>
       </w:r>
     </w:p>
     <w:p>
@@ -82,7 +82,7 @@
         <w:spacing w:after="40"/>
       </w:pPr>
       <w:r>
-        <w:t>Khoảng tin cậy 95% tính theo công thức giải tích của ETS.</w:t>
+        <w:t>Cơ chế từ chối: trước khi đưa số, hệ thống dự báo lại 6 tháng gần nhất bằng phần lịch sử còn lại và so với số thật; nếu sai số phần trăm trung bình vượt 35% thì từ chối, nêu lý do và gợi ý xem xu hướng lịch sử. Ngưỡng 35% là ngưỡng ban đầu, cần phân tích độ nhạy với dữ liệu thật.</w:t>
       </w:r>
     </w:p>
     <w:p>
@@ -91,7 +91,7 @@
         <w:spacing w:after="40"/>
       </w:pPr>
       <w:r>
-        <w:t>Cơ chế từ chối: trước khi đưa số, hệ thống dự báo lại 6 tháng gần nhất bằng chính phần lịch sử còn lại và so với số thật; nếu sai số phần trăm trung bình (MAPE) vượt 35% thì từ chối, nêu lý do và gợi ý xem xu hướng lịch sử. Ngưỡng 35% là ngưỡng ban đầu, chưa có phân tích độ nhạy để hiệu chỉnh.</w:t>
+        <w:t>Hiển thị: câu trả lời luôn mở đầu bằng nhãn 'Dự báo, không phải số liệu đã ghi nhận', kèm khoảng tin cậy, tên mô hình và sai số kiểm thử; biểu đồ phân biệt số đã ghi nhận và số dự báo.</w:t>
       </w:r>
     </w:p>
     <w:p>
@@ -100,7 +100,7 @@
         <w:spacing w:after="40"/>
       </w:pPr>
       <w:r>
-        <w:t>Cách hiển thị: câu trả lời luôn mở đầu bằng nhãn 'Dự báo, không phải số liệu đã ghi nhận', kèm khoảng tin cậy, tên mô hình và sai số kiểm thử; biểu đồ phân biệt số đã ghi nhận và số dự báo.</w:t>
+        <w:t>Số tháng dự báo là tùy chọn (mặc định 6, tối đa 12), hệ thống không hỏi lại. Câu nối tiếp như 'thêm 3 tháng nữa' kéo dài dự báo trước đó.</w:t>
       </w:r>
     </w:p>
     <w:p>
@@ -109,244 +109,7 @@
         <w:spacing w:after="40"/>
       </w:pPr>
       <w:r>
-        <w:t>Số tháng dự báo là tùy chọn (mặc định 6, tối đa 12); hệ thống không hỏi lại số tháng. Câu hỏi nối tiếp như 'thêm 3 tháng nữa' kéo dài dự báo trước đó.</w:t>
-      </w:r>
-    </w:p>
-    <w:p>
-      <w:pPr>
-        <w:pStyle w:val="Heading3"/>
-      </w:pPr>
-      <w:r>
-        <w:t>Kết quả đánh giá (backtest cuốn chiếu)</w:t>
-      </w:r>
-    </w:p>
-    <w:p>
-      <w:pPr>
-        <w:spacing w:after="120" w:line="288" w:lineRule="auto"/>
-      </w:pPr>
-      <w:r>
-        <w:rPr>
-          <w:b w:val="0"/>
-          <w:i w:val="0"/>
-        </w:rPr>
-        <w:t>Lùi dần gốc dự báo trên dữ liệu mẫu, mỗi gốc dự báo 1 đến 6 tháng rồi so với số đã ghi nhận, và so với ba phương pháp đơn giản (naive, seasonal naive, trung bình 3 tháng).</w:t>
-      </w:r>
-    </w:p>
-    <w:tbl>
-      <w:tblPr>
-        <w:tblStyle w:val="TableGrid"/>
-        <w:tblW w:type="auto" w:w="0"/>
-        <w:jc w:val="center"/>
-        <w:tblLook w:firstColumn="1" w:firstRow="1" w:lastColumn="0" w:lastRow="0" w:noHBand="0" w:noVBand="1" w:val="04A0"/>
-      </w:tblPr>
-      <w:tblGrid>
-        <w:gridCol w:w="2353"/>
-        <w:gridCol w:w="2353"/>
-        <w:gridCol w:w="2353"/>
-        <w:gridCol w:w="2353"/>
-      </w:tblGrid>
-      <w:tr>
-        <w:tc>
-          <w:tcPr>
-            <w:tcW w:type="dxa" w:w="1814"/>
-            <w:shd w:val="clear" w:color="auto" w:fill="1F4E3D"/>
-          </w:tcPr>
-          <w:p>
-            <w:r/>
-            <w:r>
-              <w:rPr>
-                <w:b/>
-                <w:color w:val="FFFFFF"/>
-                <w:sz w:val="19"/>
-              </w:rPr>
-              <w:t>Chỉ số</w:t>
-            </w:r>
-          </w:p>
-        </w:tc>
-        <w:tc>
-          <w:tcPr>
-            <w:tcW w:type="dxa" w:w="1701"/>
-            <w:shd w:val="clear" w:color="auto" w:fill="1F4E3D"/>
-          </w:tcPr>
-          <w:p>
-            <w:r/>
-            <w:r>
-              <w:rPr>
-                <w:b/>
-                <w:color w:val="FFFFFF"/>
-                <w:sz w:val="19"/>
-              </w:rPr>
-              <w:t>Số gốc dự báo</w:t>
-            </w:r>
-          </w:p>
-        </w:tc>
-        <w:tc>
-          <w:tcPr>
-            <w:tcW w:type="dxa" w:w="3118"/>
-            <w:shd w:val="clear" w:color="auto" w:fill="1F4E3D"/>
-          </w:tcPr>
-          <w:p>
-            <w:r/>
-            <w:r>
-              <w:rPr>
-                <w:b/>
-                <w:color w:val="FFFFFF"/>
-                <w:sz w:val="19"/>
-              </w:rPr>
-              <w:t>WAPE ETS (chân trời 1 đến 6)</w:t>
-            </w:r>
-          </w:p>
-        </w:tc>
-        <w:tc>
-          <w:tcPr>
-            <w:tcW w:type="dxa" w:w="2835"/>
-            <w:shd w:val="clear" w:color="auto" w:fill="1F4E3D"/>
-          </w:tcPr>
-          <w:p>
-            <w:r/>
-            <w:r>
-              <w:rPr>
-                <w:b/>
-                <w:color w:val="FFFFFF"/>
-                <w:sz w:val="19"/>
-              </w:rPr>
-              <w:t>Khoảng tin cậy 95% thực tế phủ</w:t>
-            </w:r>
-          </w:p>
-        </w:tc>
-      </w:tr>
-      <w:tr>
-        <w:tc>
-          <w:tcPr>
-            <w:tcW w:type="dxa" w:w="1814"/>
-          </w:tcPr>
-          <w:p>
-            <w:r/>
-            <w:r>
-              <w:rPr>
-                <w:sz w:val="19"/>
-              </w:rPr>
-              <w:t>Doanh thu</w:t>
-            </w:r>
-          </w:p>
-        </w:tc>
-        <w:tc>
-          <w:tcPr>
-            <w:tcW w:type="dxa" w:w="1701"/>
-          </w:tcPr>
-          <w:p>
-            <w:r/>
-            <w:r>
-              <w:rPr>
-                <w:sz w:val="19"/>
-              </w:rPr>
-              <w:t>12</w:t>
-            </w:r>
-          </w:p>
-        </w:tc>
-        <w:tc>
-          <w:tcPr>
-            <w:tcW w:type="dxa" w:w="3118"/>
-          </w:tcPr>
-          <w:p>
-            <w:r/>
-            <w:r>
-              <w:rPr>
-                <w:sz w:val="19"/>
-              </w:rPr>
-              <w:t>khoảng 18% đến 26%</w:t>
-            </w:r>
-          </w:p>
-        </w:tc>
-        <w:tc>
-          <w:tcPr>
-            <w:tcW w:type="dxa" w:w="2835"/>
-          </w:tcPr>
-          <w:p>
-            <w:r/>
-            <w:r>
-              <w:rPr>
-                <w:sz w:val="19"/>
-              </w:rPr>
-              <w:t>67% đến 92%</w:t>
-            </w:r>
-          </w:p>
-        </w:tc>
-      </w:tr>
-      <w:tr>
-        <w:tc>
-          <w:tcPr>
-            <w:tcW w:type="dxa" w:w="1814"/>
-          </w:tcPr>
-          <w:p>
-            <w:r/>
-            <w:r>
-              <w:rPr>
-                <w:sz w:val="19"/>
-              </w:rPr>
-              <w:t>Sản lượng</w:t>
-            </w:r>
-          </w:p>
-        </w:tc>
-        <w:tc>
-          <w:tcPr>
-            <w:tcW w:type="dxa" w:w="1701"/>
-          </w:tcPr>
-          <w:p>
-            <w:r/>
-            <w:r>
-              <w:rPr>
-                <w:sz w:val="19"/>
-              </w:rPr>
-              <w:t>11</w:t>
-            </w:r>
-          </w:p>
-        </w:tc>
-        <w:tc>
-          <w:tcPr>
-            <w:tcW w:type="dxa" w:w="3118"/>
-          </w:tcPr>
-          <w:p>
-            <w:r/>
-            <w:r>
-              <w:rPr>
-                <w:sz w:val="19"/>
-              </w:rPr>
-              <w:t>khoảng 18% đến 26%</w:t>
-            </w:r>
-          </w:p>
-        </w:tc>
-        <w:tc>
-          <w:tcPr>
-            <w:tcW w:type="dxa" w:w="2835"/>
-          </w:tcPr>
-          <w:p>
-            <w:r/>
-            <w:r>
-              <w:rPr>
-                <w:sz w:val="19"/>
-              </w:rPr>
-              <w:t>82% đến 100%</w:t>
-            </w:r>
-          </w:p>
-        </w:tc>
-      </w:tr>
-    </w:tbl>
-    <w:p>
-      <w:pPr>
-        <w:spacing w:after="80"/>
-      </w:pPr>
-    </w:p>
-    <w:p>
-      <w:pPr>
-        <w:spacing w:after="120" w:line="288" w:lineRule="auto"/>
-      </w:pPr>
-      <w:r>
-        <w:rPr>
-          <w:b w:val="0"/>
-          <w:i w:val="0"/>
-        </w:rPr>
-        <w:t>Kết luận: ETS tương đương các phương pháp đơn giản trên dữ liệu mẫu, chưa chứng minh vượt trội. Dữ liệu mô phỏng và ngắn (số mẫu mỗi chân trời từ 7 đến 12). Vì vậy dự báo luôn có nhãn và cơ chế từ chối; cần dữ liệu thật dài hơn trước khi dùng cho quyết định nghiệp vụ.</w:t>
+        <w:t>Độ chính xác của dự báo không được cam kết trong tài liệu này; được đánh giá bằng backtest cuốn chiếu so với các phương pháp đơn giản, xem báo cáo kiểm thử.</w:t>
       </w:r>
     </w:p>
     <w:p>
@@ -477,7 +240,7 @@
               <w:rPr>
                 <w:sz w:val="19"/>
               </w:rPr>
-              <w:t>Câu hỏi (tối đa 1000 ký tự); ngày dữ liệu; danh mục chỉ số, chiều, tên khu vực và nhà máy đã duyệt; phiếu yêu cầu lượt trước; tối đa 6 lượt gần nhất (câu hỏi và câu trả lời, số tiền và tỷ lệ đã thay bằng [số])</w:t>
+              <w:t>Câu hỏi (tối đa 1000 ký tự); ngày dữ liệu; danh mục chỉ số, chiều, tên khu vực và nhà máy đã duyệt; phiếu yêu cầu lượt trước; tối đa 6 lượt gần nhất (câu hỏi và câu trả lời, số tiền và tỷ lệ thay bằng [số])</w:t>
             </w:r>
           </w:p>
         </w:tc>
@@ -757,7 +520,7 @@
           <w:b w:val="0"/>
           <w:i w:val="0"/>
         </w:rPr>
-        <w:t>Chưa có và là điều kiện trước khi dùng dữ liệu thật: rà soát điều khoản lưu giữ và huấn luyện của từng nhà cung cấp (đặc biệt gói miễn phí), phân loại dữ liệu theo mức nhạy cảm, che thêm các trường nhạy cảm, kiểm thử xâm nhập độc lập.</w:t>
+        <w:t>Điều kiện trước khi dùng dữ liệu thật: rà soát điều khoản lưu giữ và huấn luyện của từng nhà cung cấp AI, phân loại dữ liệu theo mức nhạy cảm, che thêm các trường nhạy cảm, kiểm thử xâm nhập độc lập.</w:t>
       </w:r>
     </w:p>
     <w:p>
@@ -765,7 +528,7 @@
         <w:pStyle w:val="Heading1"/>
       </w:pPr>
       <w:r>
-        <w:t>C. Kiểm tra SQL và xử lý SQL do AI đề xuất (bổ sung mục 8.3)</w:t>
+        <w:t>C. Kiểm tra SQL (bổ sung mục 8.3)</w:t>
       </w:r>
     </w:p>
     <w:p>
@@ -783,7 +546,7 @@
         <w:spacing w:after="40"/>
       </w:pPr>
       <w:r>
-        <w:t>Khi SQL do AI đề xuất lệch khuôn đã duyệt (ví dụ ghi ngày cụ thể thay vì tham số, thêm bộ lọc hoặc nối bảng không được phép), lỗi được gửi lại cho AI để sửa tối đa 2 lần. Các lỗi an toàn (ghi dữ liệu, bảng hoặc hàm ngoài danh sách cho phép, vượt phạm vi quyền) không bao giờ được thử lại.</w:t>
+        <w:t>SQL do AI đề xuất lệch khuôn đã duyệt (ghi ngày cụ thể thay vì tham số, thêm bộ lọc hoặc nối bảng không được phép) được gửi lại cho AI sửa tối đa 2 lần. Lỗi an toàn (ghi dữ liệu, bảng hoặc hàm ngoài danh sách cho phép, vượt phạm vi quyền) không bao giờ được thử lại.</w:t>
       </w:r>
     </w:p>
     <w:p>
@@ -792,7 +555,7 @@
         <w:spacing w:after="40"/>
       </w:pPr>
       <w:r>
-        <w:t>Ngày trùng đúng kỳ đã tính được đổi thành tham số trước khi kiểm tra; ngày khác vẫn bị từ chối.</w:t>
+        <w:t>Lớp phạm vi bao bảng nguồn bằng một truy vấn con giới hạn đúng kỳ và quyền của người dùng, nên SQL của đường RAG có điều kiện ngày ở cả truy vấn con và truy vấn ngoài, dùng cùng tham số.</w:t>
       </w:r>
     </w:p>
     <w:p>
@@ -801,7 +564,7 @@
         <w:spacing w:after="40"/>
       </w:pPr>
       <w:r>
-        <w:t>Điều kiện ngày xuất hiện hai lần trong SQL của đường RAG là do lớp phạm vi: lớp này bao bảng nguồn bằng một truy vấn con giới hạn đúng kỳ và quyền của người dùng, rồi truy vấn bên ngoài lọc ngày theo yêu cầu. Hai điều kiện dùng cùng tham số kỳ; đó không phải lỗi.</w:t>
+        <w:t>Giới hạn dòng: 100 cho danh sách thông thường, 250 cho biểu đồ chồng, 400 cho nhóm theo ngày, tuần, tháng; kết quả chạm giới hạn mà người dùng không xin top N thì có thông báo chỉ hiển thị các dòng đầu.</w:t>
       </w:r>
     </w:p>
     <w:p>
@@ -810,25 +573,7 @@
         <w:spacing w:after="40"/>
       </w:pPr>
       <w:r>
-        <w:t>Giới hạn dòng: 100 dòng cho danh sách thông thường, 250 cho biểu đồ chồng, 400 cho nhóm theo ngày, tuần, tháng (đủ một năm có 366 ngày). Kết quả chạm giới hạn mà người dùng không xin top N sẽ kèm thông báo chỉ hiển thị các dòng đầu.</w:t>
-      </w:r>
-    </w:p>
-    <w:p>
-      <w:pPr>
-        <w:pStyle w:val="ListBullet"/>
-        <w:spacing w:after="40"/>
-      </w:pPr>
-      <w:r>
-        <w:t>Hỏi so sánh hai nhà máy chỉ hiển thị hai nhà máy được nêu và ghi rõ phần chưa gồm (ví dụ nhóm chưa gán nhà máy) cùng giá trị của nó.</w:t>
-      </w:r>
-    </w:p>
-    <w:p>
-      <w:pPr>
-        <w:pStyle w:val="ListBullet"/>
-        <w:spacing w:after="40"/>
-      </w:pPr>
-      <w:r>
-        <w:t>Yêu cầu bị từ chối được quyết định trước khi tới kho dữ liệu; có kiểm thử tự động chứng minh hàm truy vấn kho không được gọi khi bị từ chối (vai trò kinh doanh, sản xuất, quản trị IT).</w:t>
+        <w:t>Yêu cầu bị từ chối được quyết định trước khi tới kho dữ liệu.</w:t>
       </w:r>
     </w:p>
     <w:p>
@@ -845,7 +590,7 @@
         <w:spacing w:after="40"/>
       </w:pPr>
       <w:r>
-        <w:t>Ngữ cảnh gửi cho AI gồm tối đa 6 lượt gần nhất; số tiền và tỷ lệ trong câu trả lời trước được thay bằng [số], chỉ giữ tên và ngày để giải quyết các cách nói như 'khu vực đứng đầu'.</w:t>
+        <w:t>Ngữ cảnh gửi cho AI gồm tối đa 6 lượt gần nhất; số tiền và tỷ lệ của câu trả lời trước được thay bằng [số], chỉ giữ tên và ngày để giải quyết các cách nói như 'khu vực đứng đầu'.</w:t>
       </w:r>
     </w:p>
     <w:p>
@@ -854,7 +599,7 @@
         <w:spacing w:after="40"/>
       </w:pPr>
       <w:r>
-        <w:t>Kỳ do AI chọn được kiểm tra lại bằng kỳ nêu trong câu hỏi: nếu câu nêu đúng một năm, quý hoặc tháng mà AI trả kỳ khác thì dùng kỳ trong câu; nếu câu không có từ nào về thời gian và không có kỳ trước đó để kế thừa thì hệ thống hỏi lại thay vì đoán.</w:t>
+        <w:t>Kỳ do AI chọn được kiểm tra lại với câu hỏi: câu nêu đúng một năm, quý hoặc tháng thì dùng kỳ đó; câu không có từ nào về thời gian và không có kỳ trước để kế thừa thì hệ thống hỏi lại thay vì đoán.</w:t>
       </w:r>
     </w:p>
     <w:p>
@@ -863,7 +608,7 @@
         <w:spacing w:after="40"/>
       </w:pPr>
       <w:r>
-        <w:t>Chỉ có từ chỉ tương lai (dự báo, dự đoán, tháng tới, next...) mới được xử lý như dự báo, bất kể AI gán nhãn gì cho câu hỏi mới.</w:t>
+        <w:t>Chỉ câu có từ chỉ tương lai (dự báo, dự đoán, tháng tới...) mới được xử lý như dự báo, bất kể AI gán nhãn gì.</w:t>
       </w:r>
     </w:p>
     <w:p>
@@ -872,7 +617,7 @@
         <w:spacing w:after="40"/>
       </w:pPr>
       <w:r>
-        <w:t>Nhà máy do người dùng gọi tên luôn là bộ lọc, kể cả khi AI bỏ sót.</w:t>
+        <w:t>Nhà máy do người dùng gọi tên luôn là bộ lọc; hỏi so sánh hai nhà máy chỉ hiển thị hai nhà máy đó và ghi rõ phần chưa gồm.</w:t>
       </w:r>
     </w:p>
     <w:p>
@@ -880,7 +625,7 @@
         <w:pStyle w:val="Heading1"/>
       </w:pPr>
       <w:r>
-        <w:t>E. Nhà cung cấp AI và độ ổn định (bổ sung mục 8.6, 9.2)</w:t>
+        <w:t>E. Nhà cung cấp AI và xử lý khi AI bận (bổ sung mục 8.6 và 9.2)</w:t>
       </w:r>
     </w:p>
     <w:p>
@@ -889,7 +634,7 @@
         <w:spacing w:after="40"/>
       </w:pPr>
       <w:r>
-        <w:t>Nhiều nhà cung cấp và nhiều khóa được thử lần lượt theo thứ tự cấu hình; khóa lỗi nghỉ theo nguyên nhân (hết hạn mức ngày: 1 giờ; giới hạn tốc độ: theo thời gian nhà cung cấp báo; lỗi máy chủ: 30 giây).</w:t>
+        <w:t>Khi vận hành chính thức dùng một nhà cung cấp AI trả phí (API Claude) hoặc mô hình chạy offline trên máy chủ riêng, chọn theo mục G. Lớp gọi AI nằm sau một giao diện chung nên đổi nhà cung cấp chỉ là đổi cấu hình.</w:t>
       </w:r>
     </w:p>
     <w:p>
@@ -898,7 +643,7 @@
         <w:spacing w:after="40"/>
       </w:pPr>
       <w:r>
-        <w:t>Mọi trường hợp nhà cung cấp trả mã giới hạn (429 hoặc 403 có chữ limit) hoặc quá tải (5xx) đều được báo cho người dùng là 'AI đang bận, thử lại sau', không bao giờ trả kết quả sai.</w:t>
+        <w:t>Việc xoay vòng nhiều nhà cung cấp và nhiều khóa miễn phí chỉ là phương án tạm cho giai đoạn demo để không tốn chi phí; không phải một phần của thiết kế lâu dài và sẽ gỡ bỏ khi chuyển sang gói trả phí.</w:t>
       </w:r>
     </w:p>
     <w:p>
@@ -907,7 +652,7 @@
         <w:spacing w:after="40"/>
       </w:pPr>
       <w:r>
-        <w:t>Giao diện có ô chọn AI: tự động hoặc một nhà cụ thể; nhà được chọn trả lời một mình. Trang hiển thị nhà nào đang nghỉ, còn bao lâu, và nút Kiểm tra gửi yêu cầu nhỏ để biết nhà đó dùng được không.</w:t>
+        <w:t>Thiết kế lâu dài: mọi trường hợp nhà cung cấp trả mã giới hạn (429, hoặc 403 có chữ limit) hoặc quá tải (5xx) đều được báo là 'AI đang bận, thử lại sau', không bao giờ trả kết quả sai.</w:t>
       </w:r>
     </w:p>
     <w:p>
@@ -916,7 +661,7 @@
         <w:spacing w:after="40"/>
       </w:pPr>
       <w:r>
-        <w:t>Có thể chạy mô hình trên máy nội bộ qua Ollama (tùy chọn). Thử với mô hình 7 tỷ tham số trên GPU 4GB: mỗi lời gọi 17 đến 35 giây, chất lượng kém hơn rõ (câu khó 88/90, so sánh 43/47) so với Gemini (90/90, 47/47).</w:t>
+        <w:t>Câu rõ ràng được tra từ điển nghiệp vụ và không cần gọi AI, nên không phụ thuộc hạn mức.</w:t>
       </w:r>
     </w:p>
     <w:p>
@@ -924,7 +669,7 @@
         <w:pStyle w:val="Heading1"/>
       </w:pPr>
       <w:r>
-        <w:t>F. Triển khai (bổ sung mục 7)</w:t>
+        <w:t>F. Tiêu chí chất lượng (bổ sung mục 10.2)</w:t>
       </w:r>
     </w:p>
     <w:p>
@@ -936,27 +681,7 @@
           <w:b w:val="0"/>
           <w:i w:val="0"/>
         </w:rPr>
-        <w:t>Có hai hình thức triển khai. Bản đề xuất: Docker Compose ba container (web, backend, cơ sở dữ liệu ứng dụng) trên một máy chủ. Bản demo hiện tại: Vercel (giao diện và backend dạng hàm), PostgreSQL trên Neon, dịch vụ AI bên ngoài; trạng thái nghỉ của khóa AI được ghi nhớ theo từng instance nên nút Kiểm tra mới phản ánh đúng. Dịch vụ giọng nói chưa bật trên bản demo.</w:t>
-      </w:r>
-    </w:p>
-    <w:p>
-      <w:pPr>
-        <w:pStyle w:val="Heading1"/>
-      </w:pPr>
-      <w:r>
-        <w:t>G. Chất lượng và kiểm thử (bổ sung mục 10.2)</w:t>
-      </w:r>
-    </w:p>
-    <w:p>
-      <w:pPr>
-        <w:spacing w:after="120" w:line="288" w:lineRule="auto"/>
-      </w:pPr>
-      <w:r>
-        <w:rPr>
-          <w:b w:val="0"/>
-          <w:i w:val="0"/>
-        </w:rPr>
-        <w:t>Phương pháp: mỗi ca kiểm thử là một câu hỏi (hoặc chuỗi câu nối tiếp) gửi qua giao diện lập trình của chính trang web bằng tài khoản thật theo vai trò, kèm điều kiện đạt. Mọi con số trong câu trả lời có bảng được tính lại bằng một câu SQL độc lập, chỉ đọc, trực tiếp trên kho dữ liệu (không dùng bộ dựng truy vấn của ứng dụng), so từng dòng. Ca báo AI bận được chạy lại cho đến khi không còn báo bận; kết quả lần chạy đầu được giữ riêng.</w:t>
+        <w:t>Tiêu chí đạt cho các kịch bản chất lượng; kết quả đo nằm ở báo cáo kiểm thử.</w:t>
       </w:r>
     </w:p>
     <w:tbl>
@@ -974,7 +699,7 @@
       <w:tr>
         <w:tc>
           <w:tcPr>
-            <w:tcW w:type="dxa" w:w="1814"/>
+            <w:tcW w:type="dxa" w:w="1701"/>
             <w:shd w:val="clear" w:color="auto" w:fill="1F4E3D"/>
           </w:tcPr>
           <w:p>
@@ -985,13 +710,13 @@
                 <w:color w:val="FFFFFF"/>
                 <w:sz w:val="19"/>
               </w:rPr>
-              <w:t>Bộ</w:t>
+              <w:t>Yêu cầu</w:t>
             </w:r>
           </w:p>
         </w:tc>
         <w:tc>
           <w:tcPr>
-            <w:tcW w:type="dxa" w:w="1134"/>
+            <w:tcW w:type="dxa" w:w="4082"/>
             <w:shd w:val="clear" w:color="auto" w:fill="1F4E3D"/>
           </w:tcPr>
           <w:p>
@@ -1002,13 +727,13 @@
                 <w:color w:val="FFFFFF"/>
                 <w:sz w:val="19"/>
               </w:rPr>
-              <w:t>Số ca</w:t>
+              <w:t>Cách kiểm chứng</w:t>
             </w:r>
           </w:p>
         </w:tc>
         <w:tc>
           <w:tcPr>
-            <w:tcW w:type="dxa" w:w="6520"/>
+            <w:tcW w:type="dxa" w:w="3685"/>
             <w:shd w:val="clear" w:color="auto" w:fill="1F4E3D"/>
           </w:tcPr>
           <w:p>
@@ -1019,7 +744,7 @@
                 <w:color w:val="FFFFFF"/>
                 <w:sz w:val="19"/>
               </w:rPr>
-              <w:t>Nội dung</w:t>
+              <w:t>Tiêu chí đạt</w:t>
             </w:r>
           </w:p>
         </w:tc>
@@ -1027,7 +752,7 @@
       <w:tr>
         <w:tc>
           <w:tcPr>
-            <w:tcW w:type="dxa" w:w="1814"/>
+            <w:tcW w:type="dxa" w:w="1701"/>
           </w:tcPr>
           <w:p>
             <w:r/>
@@ -1035,13 +760,13 @@
               <w:rPr>
                 <w:sz w:val="19"/>
               </w:rPr>
-              <w:t>RAG</w:t>
+              <w:t>Chính xác</w:t>
             </w:r>
           </w:p>
         </w:tc>
         <w:tc>
           <w:tcPr>
-            <w:tcW w:type="dxa" w:w="1134"/>
+            <w:tcW w:type="dxa" w:w="4082"/>
           </w:tcPr>
           <w:p>
             <w:r/>
@@ -1049,13 +774,13 @@
               <w:rPr>
                 <w:sz w:val="19"/>
               </w:rPr>
-              <w:t>24</w:t>
+              <w:t>Tính lại mỗi bảng số liệu bằng một câu SQL độc lập trên kho dữ liệu, so từng giá trị</w:t>
             </w:r>
           </w:p>
         </w:tc>
         <w:tc>
           <w:tcPr>
-            <w:tcW w:type="dxa" w:w="6520"/>
+            <w:tcW w:type="dxa" w:w="3685"/>
           </w:tcPr>
           <w:p>
             <w:r/>
@@ -1063,7 +788,7 @@
               <w:rPr>
                 <w:sz w:val="19"/>
               </w:rPr>
-              <w:t>Câu theo tuần, ngày, theo nhà máy, đủ vai trò; đối chiếu từng mốc</w:t>
+              <w:t>Không có giá trị lệch; câu thiếu dữ liệu hoặc mơ hồ thì hỏi lại hoặc từ chối, không bịa số</w:t>
             </w:r>
           </w:p>
         </w:tc>
@@ -1071,7 +796,7 @@
       <w:tr>
         <w:tc>
           <w:tcPr>
-            <w:tcW w:type="dxa" w:w="1814"/>
+            <w:tcW w:type="dxa" w:w="1701"/>
           </w:tcPr>
           <w:p>
             <w:r/>
@@ -1079,13 +804,13 @@
               <w:rPr>
                 <w:sz w:val="19"/>
               </w:rPr>
-              <w:t>Hard</w:t>
+              <w:t>Bảo mật</w:t>
             </w:r>
           </w:p>
         </w:tc>
         <w:tc>
           <w:tcPr>
-            <w:tcW w:type="dxa" w:w="1134"/>
+            <w:tcW w:type="dxa" w:w="4082"/>
           </w:tcPr>
           <w:p>
             <w:r/>
@@ -1093,13 +818,13 @@
               <w:rPr>
                 <w:sz w:val="19"/>
               </w:rPr>
-              <w:t>90</w:t>
+              <w:t>Ma trận vai trò x câu hỏi trên cả đường mẫu và RAG, kể cả câu tấn công</w:t>
             </w:r>
           </w:p>
         </w:tc>
         <w:tc>
           <w:tcPr>
-            <w:tcW w:type="dxa" w:w="6520"/>
+            <w:tcW w:type="dxa" w:w="3685"/>
           </w:tcPr>
           <w:p>
             <w:r/>
@@ -1107,7 +832,7 @@
               <w:rPr>
                 <w:sz w:val="19"/>
               </w:rPr>
-              <w:t>Bẫy ảo giác, nhiều ràng buộc, 4 vai trò, cách hỏi biến thể, hội thoại nhiều lượt</w:t>
+              <w:t>100% yêu cầu ngoài quyền bị từ chối, không có dòng dữ liệu nào lọt ra</w:t>
             </w:r>
           </w:p>
         </w:tc>
@@ -1115,7 +840,7 @@
       <w:tr>
         <w:tc>
           <w:tcPr>
-            <w:tcW w:type="dxa" w:w="1814"/>
+            <w:tcW w:type="dxa" w:w="1701"/>
           </w:tcPr>
           <w:p>
             <w:r/>
@@ -1123,13 +848,13 @@
               <w:rPr>
                 <w:sz w:val="19"/>
               </w:rPr>
-              <w:t>Compare</w:t>
+              <w:t>Truy vết</w:t>
             </w:r>
           </w:p>
         </w:tc>
         <w:tc>
           <w:tcPr>
-            <w:tcW w:type="dxa" w:w="1134"/>
+            <w:tcW w:type="dxa" w:w="4082"/>
           </w:tcPr>
           <w:p>
             <w:r/>
@@ -1137,13 +862,13 @@
               <w:rPr>
                 <w:sz w:val="19"/>
               </w:rPr>
-              <w:t>47</w:t>
+              <w:t>Mỗi câu trả lời lưu SQL, tham số, thời điểm và phiên bản định nghĩa</w:t>
             </w:r>
           </w:p>
         </w:tc>
         <w:tc>
           <w:tcPr>
-            <w:tcW w:type="dxa" w:w="6520"/>
+            <w:tcW w:type="dxa" w:w="3685"/>
           </w:tcPr>
           <w:p>
             <w:r/>
@@ -1151,7 +876,7 @@
               <w:rPr>
                 <w:sz w:val="19"/>
               </w:rPr>
-              <w:t>So sánh kỳ, tin nhắn nhiều yêu cầu</w:t>
+              <w:t>Mọi câu trả lời có số đều có nguồn</w:t>
             </w:r>
           </w:p>
         </w:tc>
@@ -1159,7 +884,7 @@
       <w:tr>
         <w:tc>
           <w:tcPr>
-            <w:tcW w:type="dxa" w:w="1814"/>
+            <w:tcW w:type="dxa" w:w="1701"/>
           </w:tcPr>
           <w:p>
             <w:r/>
@@ -1167,13 +892,13 @@
               <w:rPr>
                 <w:sz w:val="19"/>
               </w:rPr>
-              <w:t>Phân quyền</w:t>
+              <w:t>Hiệu năng (QS7)</w:t>
             </w:r>
           </w:p>
         </w:tc>
         <w:tc>
           <w:tcPr>
-            <w:tcW w:type="dxa" w:w="1134"/>
+            <w:tcW w:type="dxa" w:w="4082"/>
           </w:tcPr>
           <w:p>
             <w:r/>
@@ -1181,13 +906,13 @@
               <w:rPr>
                 <w:sz w:val="19"/>
               </w:rPr>
-              <w:t>48</w:t>
+              <w:t>Đo tải với 5 người dùng đồng thời</w:t>
             </w:r>
           </w:p>
         </w:tc>
         <w:tc>
           <w:tcPr>
-            <w:tcW w:type="dxa" w:w="6520"/>
+            <w:tcW w:type="dxa" w:w="3685"/>
           </w:tcPr>
           <w:p>
             <w:r/>
@@ -1195,7 +920,7 @@
               <w:rPr>
                 <w:sz w:val="19"/>
               </w:rPr>
-              <w:t>4 vai trò x 12 câu trên đường mẫu, RAG, dự báo, tấn công; bị từ chối thì không có dòng dữ liệu</w:t>
+              <w:t>Ít nhất 95% yêu cầu hoàn tất dưới 15 giây</w:t>
             </w:r>
           </w:p>
         </w:tc>
@@ -1203,7 +928,7 @@
       <w:tr>
         <w:tc>
           <w:tcPr>
-            <w:tcW w:type="dxa" w:w="1814"/>
+            <w:tcW w:type="dxa" w:w="1701"/>
           </w:tcPr>
           <w:p>
             <w:r/>
@@ -1211,13 +936,13 @@
               <w:rPr>
                 <w:sz w:val="19"/>
               </w:rPr>
-              <w:t>Tự động (pytest)</w:t>
+              <w:t>Dự báo</w:t>
             </w:r>
           </w:p>
         </w:tc>
         <w:tc>
           <w:tcPr>
-            <w:tcW w:type="dxa" w:w="1134"/>
+            <w:tcW w:type="dxa" w:w="4082"/>
           </w:tcPr>
           <w:p>
             <w:r/>
@@ -1225,13 +950,13 @@
               <w:rPr>
                 <w:sz w:val="19"/>
               </w:rPr>
-              <w:t>287</w:t>
+              <w:t>Backtest cuốn chiếu so với phương pháp đơn giản</w:t>
             </w:r>
           </w:p>
         </w:tc>
         <w:tc>
           <w:tcPr>
-            <w:tcW w:type="dxa" w:w="6520"/>
+            <w:tcW w:type="dxa" w:w="3685"/>
           </w:tcPr>
           <w:p>
             <w:r/>
@@ -1239,7 +964,7 @@
               <w:rPr>
                 <w:sz w:val="19"/>
               </w:rPr>
-              <w:t>Truy vấn, phân quyền, dự báo, hội thoại</w:t>
+              <w:t>Báo cáo sai số theo từng chân trời; không cam kết độ chính xác khi chưa vượt phương pháp đơn giản</w:t>
             </w:r>
           </w:p>
         </w:tc>
@@ -1252,14 +977,10 @@
     </w:p>
     <w:p>
       <w:pPr>
-        <w:spacing w:after="120" w:line="288" w:lineRule="auto"/>
+        <w:pStyle w:val="Heading1"/>
       </w:pPr>
       <w:r>
-        <w:rPr>
-          <w:b w:val="0"/>
-          <w:i w:val="0"/>
-        </w:rPr>
-        <w:t>Hiệu năng (QS7): đo với 5 người dùng đồng thời, mỗi người 12 câu: 39/60 câu trả lời được (65%), 63% hoàn tất dưới 15 giây, thấp hơn mục tiêu 95%. Mọi lỗi do nhà cung cấp AI miễn phí giới hạn tốc độ (HTTP 429); câu không cần AI trả lời trong khoảng 0,3 giây. Cần đo lại với gói AI trả phí.</w:t>
+        <w:t>G. Chi phí vận hành ước tính (bổ sung mục 11)</w:t>
       </w:r>
     </w:p>
     <w:p>
@@ -1271,15 +992,7 @@
           <w:b w:val="0"/>
           <w:i w:val="0"/>
         </w:rPr>
-        <w:t>Hạn chế đã biết: chưa pentest độc lập; chưa kiểm thử giọng nói trong môi trường thật và giao diện điện thoại; dữ liệu là dữ liệu mẫu; một số chiều phân tích (sản phẩm, ngành hàng, dây chuyền, lý do phế phẩm, tăng trưởng) chưa có truy vấn đối chiếu độc lập (xem báo cáo kiểm thử, sheet Đối chiếu độc lập).</w:t>
-      </w:r>
-    </w:p>
-    <w:p>
-      <w:pPr>
-        <w:pStyle w:val="Heading1"/>
-      </w:pPr>
-      <w:r>
-        <w:t>H. Chi phí vận hành ước tính (bổ sung mục 7 và 11)</w:t>
+        <w:t>Ước tính cho phần dịch vụ AI, theo giá tháng 10/2026; cần xác nhận lại trước khi quyết định. Chi tiết và giả định ở sheet Chi phí của báo cáo kiểm thử.</w:t>
       </w:r>
     </w:p>
     <w:tbl>
@@ -1386,7 +1099,7 @@
               <w:rPr>
                 <w:sz w:val="19"/>
               </w:rPr>
-              <w:t>Kịch bản xấu: mọi câu đều gọi AI; token đo trên lời nhắc thật rồi nhân 1,3; chưa chạy bộ kiểm thử trên Claude</w:t>
+              <w:t>Kịch bản xấu: mọi câu đều gọi AI; chưa chạy bộ kiểm thử trên Claude</w:t>
             </w:r>
           </w:p>
         </w:tc>
@@ -1474,7 +1187,7 @@
               <w:rPr>
                 <w:sz w:val="19"/>
               </w:rPr>
-              <w:t>Hetzner GEX44 184 euro/tháng; thuê RTX 4090 theo giờ 0,34 đến 0,69 USD; chưa gồm nhân sự</w:t>
+              <w:t>Chưa gồm nhân sự; dữ liệu không ra ngoài công ty</w:t>
             </w:r>
           </w:p>
         </w:tc>
@@ -1518,7 +1231,7 @@
               <w:rPr>
                 <w:sz w:val="19"/>
               </w:rPr>
-              <w:t>Dưới mức này API rẻ hơn máy chủ riêng</w:t>
+              <w:t>Dưới mức này API rẻ hơn</w:t>
             </w:r>
           </w:p>
         </w:tc>
@@ -1538,7 +1251,7 @@
           <w:b w:val="0"/>
           <w:i/>
         </w:rPr>
-        <w:t>Chi phí nhân sự vận hành: [chưa có ước tính, cần điền]. Giá API và giá máy chủ cần xác nhận lại trước khi quyết định.</w:t>
+        <w:t>Chi phí nhân sự vận hành: [chưa có ước tính, cần điền].</w:t>
       </w:r>
     </w:p>
     <w:p>
@@ -1546,7 +1259,7 @@
         <w:pStyle w:val="Heading1"/>
       </w:pPr>
       <w:r>
-        <w:t>I. Rủi ro cập nhật (bổ sung mục 11)</w:t>
+        <w:t>H. Rủi ro cập nhật (bổ sung mục 11)</w:t>
       </w:r>
     </w:p>
     <w:p>
@@ -1555,7 +1268,7 @@
         <w:spacing w:after="40"/>
       </w:pPr>
       <w:r>
-        <w:t>Phụ thuộc hạn mức dịch vụ AI: ảnh hưởng hiệu năng nhiều người dùng đồng thời; giảm thiểu bằng gói trả phí, nhiều nhà cung cấp, báo bận rõ ràng.</w:t>
+        <w:t>Phụ thuộc hạn mức dịch vụ AI: ảnh hưởng hiệu năng khi nhiều người dùng đồng thời; giảm thiểu bằng gói trả phí hoặc mô hình offline và thông báo bận rõ ràng.</w:t>
       </w:r>
     </w:p>
     <w:p>
@@ -1564,7 +1277,7 @@
         <w:spacing w:after="40"/>
       </w:pPr>
       <w:r>
-        <w:t>Dữ liệu gửi ra dịch vụ AI: giảm thiểu bằng việc chỉ gửi câu hỏi và mô tả chỉ số, thay số tiền trong ngữ cảnh; còn thiếu rà soát điều khoản nhà cung cấp và phân loại dữ liệu.</w:t>
+        <w:t>Dữ liệu gửi ra dịch vụ AI: giảm thiểu bằng việc chỉ gửi câu hỏi và mô tả chỉ số, thay số tiền trong ngữ cảnh; còn cần rà soát điều khoản nhà cung cấp và phân loại dữ liệu.</w:t>
       </w:r>
     </w:p>
     <w:p>
@@ -1573,16 +1286,7 @@
         <w:spacing w:after="40"/>
       </w:pPr>
       <w:r>
-        <w:t>Độ chính xác của dự báo: chỉ tương đương phương pháp đơn giản trên dữ liệu mẫu; giảm thiểu bằng nhãn, khoảng tin cậy và cơ chế từ chối; cần dữ liệu thật.</w:t>
-      </w:r>
-    </w:p>
-    <w:p>
-      <w:pPr>
-        <w:pStyle w:val="ListBullet"/>
-        <w:spacing w:after="40"/>
-      </w:pPr>
-      <w:r>
-        <w:t>Bằng chứng kiểm thử phụ thuộc môi trường demo và dữ liệu mẫu; cần lặp lại trên dữ liệu thật trước khi sản xuất.</w:t>
+        <w:t>Độ chính xác của dự báo: giảm thiểu bằng nhãn, khoảng tin cậy và cơ chế từ chối; cần dữ liệu thật dài hơn để đánh giá.</w:t>
       </w:r>
     </w:p>
     <w:sectPr>

</xml_diff>

<commit_message>
Drop forecast from the v1.1 supplement: provisional and business-dependent
</commit_message>
<xml_diff>
--- a/docs/ACBI_Technical_Solution_Proposal_v1.1_bo_sung.docx
+++ b/docs/ACBI_Technical_Solution_Proposal_v1.1_bo_sung.docx
@@ -22,7 +22,7 @@
           <w:i w:val="0"/>
           <w:color w:val="555B66"/>
         </w:rPr>
-        <w:t>Chỉ gồm thiết kế lâu dài mà hệ thống đã có nhưng bản v1.0 chưa mô tả. Mỗi mục ghi rõ chèn vào mục nào của tài liệu. Kết quả đo và số liệu kiểm thử không nằm ở đây mà ở báo cáo kiểm thử (docs/ACBI_bao_cao_kiem_thu.xlsx).</w:t>
+        <w:t>Chỉ gồm thiết kế lâu dài mà hệ thống đã có nhưng bản v1.0 chưa mô tả. Dự báo chưa đưa vào vì còn phụ thuộc nghiệp vụ, hiện chỉ là chức năng tạm. Mỗi mục ghi rõ chèn vào mục nào của tài liệu. Kết quả đo và số liệu kiểm thử không nằm ở đây mà ở báo cáo kiểm thử (docs/ACBI_bao_cao_kiem_thu.xlsx).</w:t>
       </w:r>
     </w:p>
     <w:p>
@@ -43,81 +43,7 @@
         <w:pStyle w:val="Heading1"/>
       </w:pPr>
       <w:r>
-        <w:t>A. Dự báo (chèn vào mục 4.2 và 8)</w:t>
-      </w:r>
-    </w:p>
-    <w:p>
-      <w:pPr>
-        <w:spacing w:after="120" w:line="288" w:lineRule="auto"/>
-      </w:pPr>
-      <w:r>
-        <w:rPr>
-          <w:b w:val="0"/>
-          <w:i w:val="0"/>
-        </w:rPr>
-        <w:t>Hệ thống dự báo doanh thu và sản lượng theo tháng. Các tỷ lệ (tỷ lệ lỗi, tỷ lệ đúng hạn) không dự báo vì không cộng dồn được.</w:t>
-      </w:r>
-    </w:p>
-    <w:p>
-      <w:pPr>
-        <w:pStyle w:val="ListBullet"/>
-        <w:spacing w:after="40"/>
-      </w:pPr>
-      <w:r>
-        <w:t>Dữ liệu vào: tổng theo tháng của 36 tháng đầy đủ gần nhất (chỉ tháng đã kết thúc); cần tối thiểu 24 tháng và chuỗi không đứt quãng.</w:t>
-      </w:r>
-    </w:p>
-    <w:p>
-      <w:pPr>
-        <w:pStyle w:val="ListBullet"/>
-        <w:spacing w:after="40"/>
-      </w:pPr>
-      <w:r>
-        <w:t>Phương pháp: ETS (làm trơn hàm mũ) theo Hyndman (2008), sáu cấu hình (không xu hướng, xu hướng cộng, xu hướng cộng tắt dần, mỗi loại có hoặc không mùa vụ 12 tháng), chọn theo tiêu chí AICc; khoảng tin cậy 95% theo công thức giải tích của ETS. Cài đặt được đối chiếu với thư viện statsmodels trong kiểm thử tự động.</w:t>
-      </w:r>
-    </w:p>
-    <w:p>
-      <w:pPr>
-        <w:pStyle w:val="ListBullet"/>
-        <w:spacing w:after="40"/>
-      </w:pPr>
-      <w:r>
-        <w:t>Cơ chế từ chối: trước khi đưa số, hệ thống dự báo lại 6 tháng gần nhất bằng phần lịch sử còn lại và so với số thật; nếu sai số phần trăm trung bình vượt 35% thì từ chối, nêu lý do và gợi ý xem xu hướng lịch sử. Ngưỡng 35% là ngưỡng ban đầu, cần phân tích độ nhạy với dữ liệu thật.</w:t>
-      </w:r>
-    </w:p>
-    <w:p>
-      <w:pPr>
-        <w:pStyle w:val="ListBullet"/>
-        <w:spacing w:after="40"/>
-      </w:pPr>
-      <w:r>
-        <w:t>Hiển thị: câu trả lời luôn mở đầu bằng nhãn 'Dự báo, không phải số liệu đã ghi nhận', kèm khoảng tin cậy, tên mô hình và sai số kiểm thử; biểu đồ phân biệt số đã ghi nhận và số dự báo.</w:t>
-      </w:r>
-    </w:p>
-    <w:p>
-      <w:pPr>
-        <w:pStyle w:val="ListBullet"/>
-        <w:spacing w:after="40"/>
-      </w:pPr>
-      <w:r>
-        <w:t>Số tháng dự báo là tùy chọn (mặc định 6, tối đa 12), hệ thống không hỏi lại. Câu nối tiếp như 'thêm 3 tháng nữa' kéo dài dự báo trước đó.</w:t>
-      </w:r>
-    </w:p>
-    <w:p>
-      <w:pPr>
-        <w:pStyle w:val="ListBullet"/>
-        <w:spacing w:after="40"/>
-      </w:pPr>
-      <w:r>
-        <w:t>Độ chính xác của dự báo không được cam kết trong tài liệu này; được đánh giá bằng backtest cuốn chiếu so với các phương pháp đơn giản, xem báo cáo kiểm thử.</w:t>
-      </w:r>
-    </w:p>
-    <w:p>
-      <w:pPr>
-        <w:pStyle w:val="Heading1"/>
-      </w:pPr>
-      <w:r>
-        <w:t>B. Dữ liệu gửi ra dịch vụ AI bên ngoài (chèn vào mục 3.2, 8.3 và 11)</w:t>
+        <w:t>A. Dữ liệu gửi ra dịch vụ AI bên ngoài (chèn vào mục 3.2, 8.3 và 11)</w:t>
       </w:r>
     </w:p>
     <w:p>
@@ -528,7 +454,7 @@
         <w:pStyle w:val="Heading1"/>
       </w:pPr>
       <w:r>
-        <w:t>C. Kiểm tra SQL (bổ sung mục 8.3)</w:t>
+        <w:t>B. Kiểm tra SQL (bổ sung mục 8.3)</w:t>
       </w:r>
     </w:p>
     <w:p>
@@ -581,7 +507,7 @@
         <w:pStyle w:val="Heading1"/>
       </w:pPr>
       <w:r>
-        <w:t>D. Ngữ cảnh hội thoại (bổ sung mục 8.4)</w:t>
+        <w:t>C. Ngữ cảnh hội thoại (bổ sung mục 8.4)</w:t>
       </w:r>
     </w:p>
     <w:p>
@@ -608,15 +534,6 @@
         <w:spacing w:after="40"/>
       </w:pPr>
       <w:r>
-        <w:t>Chỉ câu có từ chỉ tương lai (dự báo, dự đoán, tháng tới...) mới được xử lý như dự báo, bất kể AI gán nhãn gì.</w:t>
-      </w:r>
-    </w:p>
-    <w:p>
-      <w:pPr>
-        <w:pStyle w:val="ListBullet"/>
-        <w:spacing w:after="40"/>
-      </w:pPr>
-      <w:r>
         <w:t>Nhà máy do người dùng gọi tên luôn là bộ lọc; hỏi so sánh hai nhà máy chỉ hiển thị hai nhà máy đó và ghi rõ phần chưa gồm.</w:t>
       </w:r>
     </w:p>
@@ -625,7 +542,7 @@
         <w:pStyle w:val="Heading1"/>
       </w:pPr>
       <w:r>
-        <w:t>E. Nhà cung cấp AI và xử lý khi AI bận (bổ sung mục 8.6 và 9.2)</w:t>
+        <w:t>D. Nhà cung cấp AI và xử lý khi AI bận (bổ sung mục 8.6 và 9.2)</w:t>
       </w:r>
     </w:p>
     <w:p>
@@ -669,7 +586,7 @@
         <w:pStyle w:val="Heading1"/>
       </w:pPr>
       <w:r>
-        <w:t>F. Tiêu chí chất lượng (bổ sung mục 10.2)</w:t>
+        <w:t>E. Tiêu chí chất lượng (bổ sung mục 10.2)</w:t>
       </w:r>
     </w:p>
     <w:p>
@@ -925,50 +842,6 @@
           </w:p>
         </w:tc>
       </w:tr>
-      <w:tr>
-        <w:tc>
-          <w:tcPr>
-            <w:tcW w:type="dxa" w:w="1701"/>
-          </w:tcPr>
-          <w:p>
-            <w:r/>
-            <w:r>
-              <w:rPr>
-                <w:sz w:val="19"/>
-              </w:rPr>
-              <w:t>Dự báo</w:t>
-            </w:r>
-          </w:p>
-        </w:tc>
-        <w:tc>
-          <w:tcPr>
-            <w:tcW w:type="dxa" w:w="4082"/>
-          </w:tcPr>
-          <w:p>
-            <w:r/>
-            <w:r>
-              <w:rPr>
-                <w:sz w:val="19"/>
-              </w:rPr>
-              <w:t>Backtest cuốn chiếu so với phương pháp đơn giản</w:t>
-            </w:r>
-          </w:p>
-        </w:tc>
-        <w:tc>
-          <w:tcPr>
-            <w:tcW w:type="dxa" w:w="3685"/>
-          </w:tcPr>
-          <w:p>
-            <w:r/>
-            <w:r>
-              <w:rPr>
-                <w:sz w:val="19"/>
-              </w:rPr>
-              <w:t>Báo cáo sai số theo từng chân trời; không cam kết độ chính xác khi chưa vượt phương pháp đơn giản</w:t>
-            </w:r>
-          </w:p>
-        </w:tc>
-      </w:tr>
     </w:tbl>
     <w:p>
       <w:pPr>
@@ -980,7 +853,7 @@
         <w:pStyle w:val="Heading1"/>
       </w:pPr>
       <w:r>
-        <w:t>G. Chi phí vận hành ước tính (bổ sung mục 11)</w:t>
+        <w:t>F. Chi phí vận hành ước tính (bổ sung mục 11)</w:t>
       </w:r>
     </w:p>
     <w:p>
@@ -1259,7 +1132,7 @@
         <w:pStyle w:val="Heading1"/>
       </w:pPr>
       <w:r>
-        <w:t>H. Rủi ro cập nhật (bổ sung mục 11)</w:t>
+        <w:t>G. Rủi ro cập nhật (bổ sung mục 11)</w:t>
       </w:r>
     </w:p>
     <w:p>
@@ -1278,15 +1151,6 @@
       </w:pPr>
       <w:r>
         <w:t>Dữ liệu gửi ra dịch vụ AI: giảm thiểu bằng việc chỉ gửi câu hỏi và mô tả chỉ số, thay số tiền trong ngữ cảnh; còn cần rà soát điều khoản nhà cung cấp và phân loại dữ liệu.</w:t>
-      </w:r>
-    </w:p>
-    <w:p>
-      <w:pPr>
-        <w:pStyle w:val="ListBullet"/>
-        <w:spacing w:after="40"/>
-      </w:pPr>
-      <w:r>
-        <w:t>Độ chính xác của dự báo: giảm thiểu bằng nhãn, khoảng tin cậy và cơ chế từ chối; cần dữ liệu thật dài hơn để đánh giá.</w:t>
       </w:r>
     </w:p>
     <w:sectPr>

</xml_diff>

<commit_message>
Add multi-request, comparison and processing-order sections to the v1.1 supplement
</commit_message>
<xml_diff>
--- a/docs/ACBI_Technical_Solution_Proposal_v1.1_bo_sung.docx
+++ b/docs/ACBI_Technical_Solution_Proposal_v1.1_bo_sung.docx
@@ -535,6 +535,24 @@
       </w:pPr>
       <w:r>
         <w:t>Nhà máy do người dùng gọi tên luôn là bộ lọc; hỏi so sánh hai nhà máy chỉ hiển thị hai nhà máy đó và ghi rõ phần chưa gồm.</w:t>
+      </w:r>
+    </w:p>
+    <w:p>
+      <w:pPr>
+        <w:pStyle w:val="ListBullet"/>
+        <w:spacing w:after="40"/>
+      </w:pPr>
+      <w:r>
+        <w:t>So sánh (kỳ với kỳ, nhà máy với nhà máy) có bộ xử lý riêng: mỗi vế dùng cùng định nghĩa chỉ số và cùng lớp phân quyền, kết quả được ghép và tính chênh lệch bằng mã, không do AI tính.</w:t>
+      </w:r>
+    </w:p>
+    <w:p>
+      <w:pPr>
+        <w:pStyle w:val="ListBullet"/>
+        <w:spacing w:after="40"/>
+      </w:pPr>
+      <w:r>
+        <w:t>Một tin nhắn có nhiều yêu cầu được tách (bằng quy tắc, hoặc AI đánh dấu), tối đa 5 yêu cầu. Mỗi yêu cầu chạy trọn một lượt xử lý riêng, có phân quyền riêng, và hiển thị thành một khối đánh số. Yêu cầu bị từ chối hoặc còn thiếu thông tin chỉ dừng khối của nó, không dừng các khối khác; yêu cầu vượt giới hạn được nêu tên là chưa thực hiện.</w:t>
       </w:r>
     </w:p>
     <w:p>
@@ -1153,6 +1171,32 @@
         <w:t>Dữ liệu gửi ra dịch vụ AI: giảm thiểu bằng việc chỉ gửi câu hỏi và mô tả chỉ số, thay số tiền trong ngữ cảnh; còn cần rà soát điều khoản nhà cung cấp và phân loại dữ liệu.</w:t>
       </w:r>
     </w:p>
+    <w:p>
+      <w:pPr>
+        <w:pStyle w:val="Heading1"/>
+      </w:pPr>
+      <w:r>
+        <w:t>H. Thứ tự xử lý yêu cầu (sửa mục 6.1 và 6.2)</w:t>
+      </w:r>
+    </w:p>
+    <w:p>
+      <w:pPr>
+        <w:pStyle w:val="ListBullet"/>
+        <w:spacing w:after="40"/>
+      </w:pPr>
+      <w:r>
+        <w:t>Mục 6.2 của v1.0 mô tả từ chối sau khi AI hiểu câu hỏi. Thực tế vai trò quản trị IT bị từ chối ngay từ đầu, trước khi gọi AI và trước khi chạm kho dữ liệu; không câu hỏi nào của vai trò này tới được bước hiểu câu.</w:t>
+      </w:r>
+    </w:p>
+    <w:p>
+      <w:pPr>
+        <w:pStyle w:val="ListBullet"/>
+        <w:spacing w:after="40"/>
+      </w:pPr>
+      <w:r>
+        <w:t>Mục 6.1 bước 4 coi AI luôn là bên hiểu câu hỏi. Thực tế câu rõ ràng được nhận diện bằng từ điển nghiệp vụ (chỉ số, chiều, kỳ, nhà máy) và chỉ những câu từ điển không xử lý được mới gọi AI. Hai đường cho ra cùng một phiếu yêu cầu và đi qua cùng bước phân quyền.</w:t>
+      </w:r>
+    </w:p>
     <w:sectPr>
       <w:pgSz w:w="11906" w:h="16838"/>
       <w:pgMar w:top="1134" w:right="1247" w:bottom="1134" w:left="1247" w:header="720" w:footer="720" w:gutter="0"/>

</xml_diff>